<commit_message>
V4 build (3/3) — props, app interactive et livres compilés
- Objets.docx : fiole→Baptiste, étiquette/notes recâblées, signatures « N. »→« B. »,
  +OBJET 04b (note scellée Maëlys au coffret), +07f (Lisa), +07g (Emilien),
  cahier des comptes (B.A./L.L./E.C.S.), journal « neuf rappels ».
- Chloe_Jeu_Interactif.html : −nicolas/romanette, +baptiste/maelys/lisa/emilien
  (4 fiches JS), manteau_baptiste, lettres « B. », note_maelys au coffret 1-7-3,
  indices Boulet (origines Lisa, terres Emilien), drames finaux recâblés.
  JS validé (node --check), dépendances de faits cohérentes (0 fact orphelin).
- Livres_finaux : Livre I (MJ) et Livre III (14 convives) régénérés depuis le
  Decoupe corrigé (couvertures + styles conservés) ; Livre II (Chloé) recâblé
  en préservant le plan. 0 résidu sur les 3 livres, plan_chloe.png intact.
Scan global : 0 résidu Nicolas/Romanette/Picolas/Burlesque sur tout le projet.
</commit_message>
<xml_diff>
--- a/Livres_finaux/Livre_II_Chloe.docx
+++ b/Livres_finaux/Livre_II_Chloe.docx
@@ -1,6 +1,6 @@
 
 <file path=word/document.xml><?xml version="1.0" encoding="utf-8"?>
-<w:document xmlns:wpc="http://schemas.microsoft.com/office/word/2010/wordprocessingCanvas" xmlns:cx="http://schemas.microsoft.com/office/drawing/2014/chartex" xmlns:cx1="http://schemas.microsoft.com/office/drawing/2015/9/8/chartex" xmlns:cx2="http://schemas.microsoft.com/office/drawing/2015/10/21/chartex" xmlns:cx3="http://schemas.microsoft.com/office/drawing/2016/5/9/chartex" xmlns:cx4="http://schemas.microsoft.com/office/drawing/2016/5/10/chartex" xmlns:cx5="http://schemas.microsoft.com/office/drawing/2016/5/11/chartex" xmlns:cx6="http://schemas.microsoft.com/office/drawing/2016/5/12/chartex" xmlns:cx7="http://schemas.microsoft.com/office/drawing/2016/5/13/chartex" xmlns:cx8="http://schemas.microsoft.com/office/drawing/2016/5/14/chartex" xmlns:mc="http://schemas.openxmlformats.org/markup-compatibility/2006" xmlns:aink="http://schemas.microsoft.com/office/drawing/2016/ink" xmlns:am3d="http://schemas.microsoft.com/office/drawing/2017/model3d" xmlns:o="urn:schemas-microsoft-com:office:office" xmlns:oel="http://schemas.microsoft.com/office/2019/extlst" xmlns:r="http://schemas.openxmlformats.org/officeDocument/2006/relationships" xmlns:m="http://schemas.openxmlformats.org/officeDocument/2006/math" xmlns:v="urn:schemas-microsoft-com:vml" xmlns:wp14="http://schemas.microsoft.com/office/word/2010/wordprocessingDrawing" xmlns:wp="http://schemas.openxmlformats.org/drawingml/2006/wordprocessingDrawing" xmlns:w10="urn:schemas-microsoft-com:office:word" xmlns:w="http://schemas.openxmlformats.org/wordprocessingml/2006/main" xmlns:w14="http://schemas.microsoft.com/office/word/2010/wordml" xmlns:w15="http://schemas.microsoft.com/office/word/2012/wordml" xmlns:w16cex="http://schemas.microsoft.com/office/word/2018/wordml/cex" xmlns:w16cid="http://schemas.microsoft.com/office/word/2016/wordml/cid" xmlns:w16="http://schemas.microsoft.com/office/word/2018/wordml" xmlns:w16sdtdh="http://schemas.microsoft.com/office/word/2020/wordml/sdtdatahash" xmlns:w16se="http://schemas.microsoft.com/office/word/2015/wordml/symex" xmlns:wpg="http://schemas.microsoft.com/office/word/2010/wordprocessingGroup" xmlns:wpi="http://schemas.microsoft.com/office/word/2010/wordprocessingInk" xmlns:wne="http://schemas.microsoft.com/office/word/2006/wordml" xmlns:wps="http://schemas.microsoft.com/office/word/2010/wordprocessingShape" mc:Ignorable="w14 w15 w16se w16cid w16 w16cex w16sdtdh wp14">
+<w:document xmlns:ns1="http://schemas.openxmlformats.org/markup-compatibility/2006" xmlns:ns2="http://schemas.openxmlformats.org/officeDocument/2006/relationships" xmlns:ns3="http://schemas.openxmlformats.org/drawingml/2006/wordprocessingDrawing" xmlns:ns4="http://schemas.openxmlformats.org/drawingml/2006/main" xmlns:ns5="http://schemas.openxmlformats.org/drawingml/2006/picture" xmlns:w="http://schemas.openxmlformats.org/wordprocessingml/2006/main" ns1:Ignorable="w14 w15 w16se w16cid w16 w16cex w16sdtdh wp14">
   <w:body>
     <w:p>
       <w:pPr>
@@ -201,8 +201,8 @@
       <w:pPr>
         <w:sectPr>
           <w:type w:val="nextPage"/>
-          <w:headerReference w:type="default" r:id="rIdHeader"/>
-          <w:footerReference w:type="default" r:id="rIdFooter"/>
+          <w:headerReference w:type="default" ns2:id="rIdHeader"/>
+          <w:footerReference w:type="default" ns2:id="rIdFooter"/>
           <w:pgSz w:w="11906" w:h="16838"/>
           <w:pgMar w:top="1700" w:right="1417" w:bottom="1700" w:left="1417" w:header="708" w:footer="708" w:gutter="0"/>
           <w:cols w:space="708"/>
@@ -449,10 +449,10 @@
           <w:b/>
           <w:bCs/>
         </w:rPr>
-        <w:t>Lord Nicolas de Picolas</w:t>
-      </w:r>
-      <w:r>
-        <w:t xml:space="preserve"> — polémiste.</w:t>
+        <w:t xml:space="preserve">Monsieur Baptiste André — caricaturiste, secrètement « M. Plumeau ».</w:t>
+      </w:r>
+      <w:r>
+        <w:t xml:space="preserve"/>
       </w:r>
     </w:p>
     <w:p>
@@ -465,10 +465,10 @@
           <w:b/>
           <w:bCs/>
         </w:rPr>
-        <w:t>Lady Romanette de Burlesque</w:t>
-      </w:r>
-      <w:r>
-        <w:t xml:space="preserve"> — lectrice.</w:t>
+        <w:t xml:space="preserve">Maître Emilien Collin-Stanislas — notaire de la famille.</w:t>
+      </w:r>
+      <w:r>
+        <w:t xml:space="preserve"/>
       </w:r>
     </w:p>
     <w:p>
@@ -481,10 +481,10 @@
           <w:b/>
           <w:bCs/>
         </w:rPr>
-        <w:t>Lady Boulet de Myrtilles</w:t>
-      </w:r>
-      <w:r>
-        <w:t xml:space="preserve"> — généalogiste amateur, mémoire prodigieuse.</w:t>
+        <w:t xml:space="preserve">Mademoiselle Maëlys Bouchard — demoiselle, votre jeune protégée.</w:t>
+      </w:r>
+      <w:r>
+        <w:t xml:space="preserve"/>
       </w:r>
     </w:p>
     <w:p>
@@ -497,10 +497,10 @@
           <w:b/>
           <w:bCs/>
         </w:rPr>
-        <w:t>Sir Tatoine de Crevonville</w:t>
-      </w:r>
-      <w:r>
-        <w:t xml:space="preserve"> — diplomate, ami du Duc.</w:t>
+        <w:t>Lady Boulet de Myrtilles</w:t>
+      </w:r>
+      <w:r>
+        <w:t xml:space="preserve"> — généalogiste amateur, mémoire prodigieuse.</w:t>
       </w:r>
     </w:p>
     <w:p>
@@ -513,10 +513,42 @@
           <w:b/>
           <w:bCs/>
         </w:rPr>
+        <w:t>Sir Tatoine de Crevonville</w:t>
+      </w:r>
+      <w:r>
+        <w:t xml:space="preserve"> — diplomate, ami du Duc.</w:t>
+      </w:r>
+    </w:p>
+    <w:p>
+      <w:pPr>
+        <w:spacing w:before="40" w:after="40" w:line="300" w:lineRule="auto"/>
+        <w:ind w:left="360"/>
+      </w:pPr>
+      <w:r>
+        <w:rPr>
+          <w:b/>
+          <w:bCs/>
+        </w:rPr>
         <w:t>Lady Cloé Fischer de Crevonville</w:t>
       </w:r>
       <w:r>
         <w:t xml:space="preserve"> — son épouse, surnommée Clochette.</w:t>
+      </w:r>
+    </w:p>
+    <w:p>
+      <w:pPr>
+        <w:spacing w:before="40" w:after="40" w:line="300" w:lineRule="auto"/>
+        <w:ind w:left="360"/>
+      </w:pPr>
+      <w:r>
+        <w:rPr>
+          <w:b/>
+          <w:bCs/>
+        </w:rPr>
+        <w:t xml:space="preserve">Mademoiselle Lisa Lepra — cantatrice, ancienne muse de Léa.</w:t>
+      </w:r>
+      <w:r>
+        <w:t xml:space="preserve"/>
       </w:r>
     </w:p>
     <w:p>
@@ -584,7 +616,7 @@
         <w:jc w:val="both"/>
       </w:pPr>
       <w:r>
-        <w:t>Aucun domestique n’est interrogeable — tous congédiés pour la soirée. Les douze convives autour de vous sont vos seules sources.</w:t>
+        <w:t xml:space="preserve">Aucun domestique n’est interrogeable — tous congédiés pour la soirée. Les quatorze convives autour de vous sont vos seules sources.</w:t>
       </w:r>
     </w:p>
     <w:p>
@@ -694,39 +726,39 @@
       </w:pPr>
       <w:r>
         <w:drawing>
-          <wp:inline xmlns:wp="http://schemas.openxmlformats.org/drawingml/2006/wordprocessingDrawing" distT="0" distB="0" distL="0" distR="0">
-            <wp:extent cx="4572000" cy="7459578"/>
-            <wp:effectExtent l="0" t="0" r="0" b="0"/>
-            <wp:docPr id="100" name="Plan du Domaine"/>
-            <wp:cNvGraphicFramePr>
-              <a:graphicFrameLocks xmlns:a="http://schemas.openxmlformats.org/drawingml/2006/main" noChangeAspect="1"/>
-            </wp:cNvGraphicFramePr>
-            <a:graphic xmlns:a="http://schemas.openxmlformats.org/drawingml/2006/main">
-              <a:graphicData uri="http://schemas.openxmlformats.org/drawingml/2006/picture">
-                <pic:pic xmlns:pic="http://schemas.openxmlformats.org/drawingml/2006/picture">
-                  <pic:nvPicPr>
-                    <pic:cNvPr id="100" name="Plan"/>
-                    <pic:cNvPicPr/>
-                  </pic:nvPicPr>
-                  <pic:blipFill>
-                    <a:blip r:embed="rIdPlanChloe"/>
-                    <a:stretch>
-                      <a:fillRect/>
-                    </a:stretch>
-                  </pic:blipFill>
-                  <pic:spPr>
-                    <a:xfrm>
-                      <a:off x="0" y="0"/>
-                      <a:ext cx="4572000" cy="7459578"/>
-                    </a:xfrm>
-                    <a:prstGeom prst="rect">
-                      <a:avLst/>
-                    </a:prstGeom>
-                  </pic:spPr>
-                </pic:pic>
-              </a:graphicData>
-            </a:graphic>
-          </wp:inline>
+          <ns3:inline distT="0" distB="0" distL="0" distR="0">
+            <ns3:extent cx="4572000" cy="7459578"/>
+            <ns3:effectExtent l="0" t="0" r="0" b="0"/>
+            <ns3:docPr id="100" name="Plan du Domaine"/>
+            <ns3:cNvGraphicFramePr>
+              <ns4:graphicFrameLocks noChangeAspect="1"/>
+            </ns3:cNvGraphicFramePr>
+            <ns4:graphic>
+              <ns4:graphicData uri="http://schemas.openxmlformats.org/drawingml/2006/picture">
+                <ns5:pic>
+                  <ns5:nvPicPr>
+                    <ns5:cNvPr id="100" name="Plan"/>
+                    <ns5:cNvPicPr/>
+                  </ns5:nvPicPr>
+                  <ns5:blipFill>
+                    <ns4:blip ns2:embed="rIdPlanChloe"/>
+                    <ns4:stretch>
+                      <ns4:fillRect/>
+                    </ns4:stretch>
+                  </ns5:blipFill>
+                  <ns5:spPr>
+                    <ns4:xfrm>
+                      <ns4:off x="0" y="0"/>
+                      <ns4:ext cx="4572000" cy="7459578"/>
+                    </ns4:xfrm>
+                    <ns4:prstGeom prst="rect">
+                      <ns4:avLst/>
+                    </ns4:prstGeom>
+                  </ns5:spPr>
+                </ns5:pic>
+              </ns4:graphicData>
+            </ns4:graphic>
+          </ns3:inline>
         </w:drawing>
       </w:r>
     </w:p>
@@ -767,8 +799,8 @@
       </w:r>
     </w:p>
     <w:sectPr>
-      <w:headerReference w:type="default" r:id="rIdHeader"/>
-      <w:footerReference w:type="default" r:id="rIdFooter"/>
+      <w:headerReference w:type="default" ns2:id="rIdHeader"/>
+      <w:footerReference w:type="default" ns2:id="rIdFooter"/>
       <w:pgBorders w:offsetFrom="page">
         <w:top w:val="thinThickSmallGap" w:sz="24" w:space="24" w:color="B8860B"/>
         <w:left w:val="thinThickSmallGap" w:sz="24" w:space="24" w:color="B8860B"/>

</xml_diff>